<commit_message>
update avec integration du nouveau table
</commit_message>
<xml_diff>
--- a/2026/AFRICATEK/reviews.docx
+++ b/2026/AFRICATEK/reviews.docx
@@ -593,10 +593,7 @@
         <w:t>calculated using the SHA-256 algorithm</w:t>
       </w:r>
       <w:r>
-        <w:t>)</w:t>
-      </w:r>
-      <w:r>
-        <w:t xml:space="preserve"> </w:t>
+        <w:t xml:space="preserve">) </w:t>
       </w:r>
       <w:r>
         <w:t>[</w:t>
@@ -914,17 +911,7 @@
           <w:kern w:val="0"/>
           <w:lang w:val="en-US"/>
         </w:rPr>
-        <w:t>En</w:t>
-      </w:r>
-      <w:r>
-        <w:rPr>
-          <w:rFonts w:ascii="AppleSystemUIFont" w:hAnsi="AppleSystemUIFont" w:cs="AppleSystemUIFont"/>
-          <w:b/>
-          <w:bCs/>
-          <w:kern w:val="0"/>
-          <w:lang w:val="en-US"/>
-        </w:rPr>
-        <w:t> </w:t>
+        <w:t>En </w:t>
       </w:r>
       <w:r>
         <w:rPr>
@@ -1610,52 +1597,7 @@
           <w:kern w:val="0"/>
           <w:lang w:val="fr-FR"/>
         </w:rPr>
-        <w:t xml:space="preserve"> celle-ci est </w:t>
-      </w:r>
-      <w:r>
-        <w:rPr>
-          <w:rFonts w:ascii="AppleSystemUIFont" w:hAnsi="AppleSystemUIFont" w:cs="AppleSystemUIFont"/>
-          <w:color w:val="0070C0"/>
-          <w:kern w:val="0"/>
-          <w:lang w:val="fr-FR"/>
-        </w:rPr>
-        <w:t>révo</w:t>
-      </w:r>
-      <w:r>
-        <w:rPr>
-          <w:rFonts w:ascii="AppleSystemUIFont" w:hAnsi="AppleSystemUIFont" w:cs="AppleSystemUIFont"/>
-          <w:color w:val="0070C0"/>
-          <w:kern w:val="0"/>
-          <w:lang w:val="fr-FR"/>
-        </w:rPr>
-        <w:t>quée</w:t>
-      </w:r>
-      <w:r>
-        <w:rPr>
-          <w:rFonts w:ascii="AppleSystemUIFont" w:hAnsi="AppleSystemUIFont" w:cs="AppleSystemUIFont"/>
-          <w:color w:val="0070C0"/>
-          <w:kern w:val="0"/>
-          <w:lang w:val="fr-FR"/>
-        </w:rPr>
-        <w:t xml:space="preserve"> </w:t>
-      </w:r>
-      <w:r>
-        <w:rPr>
-          <w:rFonts w:ascii="AppleSystemUIFont" w:hAnsi="AppleSystemUIFont" w:cs="AppleSystemUIFont"/>
-          <w:color w:val="0070C0"/>
-          <w:kern w:val="0"/>
-          <w:lang w:val="fr-FR"/>
-        </w:rPr>
-        <w:t>par l’utilisateur</w:t>
-      </w:r>
-      <w:r>
-        <w:rPr>
-          <w:rFonts w:ascii="AppleSystemUIFont" w:hAnsi="AppleSystemUIFont" w:cs="AppleSystemUIFont"/>
-          <w:color w:val="0070C0"/>
-          <w:kern w:val="0"/>
-          <w:lang w:val="fr-FR"/>
-        </w:rPr>
-        <w:t xml:space="preserve"> à travers le contrat intelligent</w:t>
+        <w:t xml:space="preserve"> celle-ci est révoquée par l’utilisateur à travers le contrat intelligent</w:t>
       </w:r>
       <w:r>
         <w:rPr>
@@ -1872,18 +1814,18 @@
           <w:kern w:val="0"/>
           <w:lang w:val="en-US"/>
         </w:rPr>
-        <w:t>En</w:t>
-      </w:r>
-      <w:r>
-        <w:rPr>
-          <w:rFonts w:ascii="AppleSystemUIFont" w:hAnsi="AppleSystemUIFont" w:cs="AppleSystemUIFont"/>
-          <w:b/>
-          <w:bCs/>
+        <w:t>En </w:t>
+      </w:r>
+      <w:r>
+        <w:rPr>
+          <w:rFonts w:ascii="AppleSystemUIFont" w:hAnsi="AppleSystemUIFont" w:cs="AppleSystemUIFont"/>
+          <w:color w:val="0070C0"/>
           <w:kern w:val="0"/>
           <w:lang w:val="en-US"/>
         </w:rPr>
-        <w:t> </w:t>
-      </w:r>
+        <w:t>:</w:t>
+      </w:r>
+      <w:proofErr w:type="gramEnd"/>
       <w:r>
         <w:rPr>
           <w:rFonts w:ascii="AppleSystemUIFont" w:hAnsi="AppleSystemUIFont" w:cs="AppleSystemUIFont"/>
@@ -1891,26 +1833,7 @@
           <w:kern w:val="0"/>
           <w:lang w:val="en-US"/>
         </w:rPr>
-        <w:t>:</w:t>
-      </w:r>
-      <w:proofErr w:type="gramEnd"/>
-      <w:r>
-        <w:rPr>
-          <w:rFonts w:ascii="AppleSystemUIFont" w:hAnsi="AppleSystemUIFont" w:cs="AppleSystemUIFont"/>
-          <w:color w:val="0070C0"/>
-          <w:kern w:val="0"/>
-          <w:lang w:val="en-US"/>
-        </w:rPr>
-        <w:t xml:space="preserve"> </w:t>
-      </w:r>
-      <w:r>
-        <w:rPr>
-          <w:rFonts w:ascii="AppleSystemUIFont" w:hAnsi="AppleSystemUIFont" w:cs="AppleSystemUIFont"/>
-          <w:color w:val="0070C0"/>
-          <w:kern w:val="0"/>
-          <w:lang w:val="en-US"/>
-        </w:rPr>
-        <w:t>If the private key is compromised, the user revokes it via the smart contract. A new key pair can be generated. Revoking a compromised key does not necessarily invalidate the authenticity of documents previously stored with th</w:t>
+        <w:t xml:space="preserve"> If the private key is compromised, the user revokes it via the smart contract. A new key pair can be generated. Revoking a compromised key does not necessarily invalidate the authenticity of documents previously stored with th</w:t>
       </w:r>
       <w:r>
         <w:rPr>
@@ -1999,95 +1922,183 @@
           <w:rFonts w:ascii="AppleSystemUIFont" w:hAnsi="AppleSystemUIFont" w:cs="AppleSystemUIFont"/>
           <w:color w:val="0070C0"/>
           <w:kern w:val="0"/>
-          <w:lang w:val="en-US"/>
+          <w:lang w:val="fr-FR"/>
         </w:rPr>
       </w:pPr>
-      <w:proofErr w:type="spellStart"/>
       <w:r>
         <w:rPr>
           <w:rFonts w:ascii="AppleSystemUIFont" w:hAnsi="AppleSystemUIFont" w:cs="AppleSystemUIFont"/>
           <w:b/>
           <w:bCs/>
           <w:kern w:val="0"/>
-          <w:lang w:val="en-US"/>
-        </w:rPr>
-        <w:t>Réponse</w:t>
-      </w:r>
-      <w:proofErr w:type="spellEnd"/>
+          <w:lang w:val="fr-FR"/>
+        </w:rPr>
+        <w:t>Réponse </w:t>
+      </w:r>
       <w:r>
         <w:rPr>
           <w:rFonts w:ascii="AppleSystemUIFont" w:hAnsi="AppleSystemUIFont" w:cs="AppleSystemUIFont"/>
           <w:b/>
           <w:bCs/>
           <w:kern w:val="0"/>
-          <w:lang w:val="en-US"/>
-        </w:rPr>
-        <w:t> </w:t>
-      </w:r>
+          <w:lang w:val="fr-FR"/>
+        </w:rPr>
+        <w:t xml:space="preserve">à ajouter à la page 6, phase 1, étape </w:t>
+      </w:r>
+      <w:proofErr w:type="gramStart"/>
       <w:r>
         <w:rPr>
           <w:rFonts w:ascii="AppleSystemUIFont" w:hAnsi="AppleSystemUIFont" w:cs="AppleSystemUIFont"/>
           <w:b/>
           <w:bCs/>
           <w:kern w:val="0"/>
-          <w:lang w:val="en-US"/>
-        </w:rPr>
-        <w:t xml:space="preserve">à </w:t>
+          <w:lang w:val="fr-FR"/>
+        </w:rPr>
+        <w:t>4</w:t>
+      </w:r>
+      <w:r>
+        <w:rPr>
+          <w:rFonts w:ascii="AppleSystemUIFont" w:hAnsi="AppleSystemUIFont" w:cs="AppleSystemUIFont"/>
+          <w:kern w:val="0"/>
+          <w:lang w:val="fr-FR"/>
+        </w:rPr>
+        <w:t>:</w:t>
+      </w:r>
+      <w:proofErr w:type="gramEnd"/>
+      <w:r>
+        <w:rPr>
+          <w:rFonts w:ascii="AppleSystemUIFont" w:hAnsi="AppleSystemUIFont" w:cs="AppleSystemUIFont"/>
+          <w:kern w:val="0"/>
+          <w:lang w:val="fr-FR"/>
+        </w:rPr>
+        <w:t xml:space="preserve"> </w:t>
+      </w:r>
+      <w:r>
+        <w:rPr>
+          <w:rFonts w:ascii="AppleSystemUIFont" w:hAnsi="AppleSystemUIFont" w:cs="AppleSystemUIFont"/>
+          <w:color w:val="0070C0"/>
+          <w:kern w:val="0"/>
+          <w:lang w:val="fr-FR"/>
+        </w:rPr>
+        <w:t>(</w:t>
       </w:r>
       <w:proofErr w:type="spellStart"/>
       <w:r>
         <w:rPr>
           <w:rFonts w:ascii="AppleSystemUIFont" w:hAnsi="AppleSystemUIFont" w:cs="AppleSystemUIFont"/>
-          <w:b/>
-          <w:bCs/>
-          <w:kern w:val="0"/>
-          <w:lang w:val="en-US"/>
-        </w:rPr>
-        <w:t>ajouter</w:t>
+          <w:color w:val="0070C0"/>
+          <w:kern w:val="0"/>
+          <w:lang w:val="fr-FR"/>
+        </w:rPr>
+        <w:t>Thus</w:t>
       </w:r>
       <w:proofErr w:type="spellEnd"/>
       <w:r>
         <w:rPr>
           <w:rFonts w:ascii="AppleSystemUIFont" w:hAnsi="AppleSystemUIFont" w:cs="AppleSystemUIFont"/>
-          <w:b/>
-          <w:bCs/>
-          <w:kern w:val="0"/>
-          <w:lang w:val="en-US"/>
-        </w:rPr>
-        <w:t xml:space="preserve"> à la page 6, phase 1, étape 4</w:t>
-      </w:r>
-      <w:r>
-        <w:rPr>
-          <w:rFonts w:ascii="AppleSystemUIFont" w:hAnsi="AppleSystemUIFont" w:cs="AppleSystemUIFont"/>
-          <w:kern w:val="0"/>
-          <w:lang w:val="en-US"/>
-        </w:rPr>
-        <w:t xml:space="preserve">: </w:t>
-      </w:r>
-      <w:r>
-        <w:rPr>
-          <w:rFonts w:ascii="AppleSystemUIFont" w:hAnsi="AppleSystemUIFont" w:cs="AppleSystemUIFont"/>
-          <w:color w:val="0070C0"/>
-          <w:kern w:val="0"/>
-          <w:lang w:val="en-US"/>
-        </w:rPr>
-        <w:t>(</w:t>
-      </w:r>
-      <w:r>
-        <w:rPr>
-          <w:rFonts w:ascii="AppleSystemUIFont" w:hAnsi="AppleSystemUIFont" w:cs="AppleSystemUIFont"/>
-          <w:color w:val="0070C0"/>
-          <w:kern w:val="0"/>
-          <w:lang w:val="en-US"/>
-        </w:rPr>
-        <w:t>Thus, when a user wants to verify authenticity</w:t>
-      </w:r>
-      <w:r>
-        <w:rPr>
-          <w:rFonts w:ascii="AppleSystemUIFont" w:hAnsi="AppleSystemUIFont" w:cs="AppleSystemUIFont"/>
-          <w:color w:val="0070C0"/>
-          <w:kern w:val="0"/>
-          <w:lang w:val="en-US"/>
+          <w:color w:val="0070C0"/>
+          <w:kern w:val="0"/>
+          <w:lang w:val="fr-FR"/>
+        </w:rPr>
+        <w:t xml:space="preserve">, </w:t>
+      </w:r>
+      <w:proofErr w:type="spellStart"/>
+      <w:r>
+        <w:rPr>
+          <w:rFonts w:ascii="AppleSystemUIFont" w:hAnsi="AppleSystemUIFont" w:cs="AppleSystemUIFont"/>
+          <w:color w:val="0070C0"/>
+          <w:kern w:val="0"/>
+          <w:lang w:val="fr-FR"/>
+        </w:rPr>
+        <w:t>when</w:t>
+      </w:r>
+      <w:proofErr w:type="spellEnd"/>
+      <w:r>
+        <w:rPr>
+          <w:rFonts w:ascii="AppleSystemUIFont" w:hAnsi="AppleSystemUIFont" w:cs="AppleSystemUIFont"/>
+          <w:color w:val="0070C0"/>
+          <w:kern w:val="0"/>
+          <w:lang w:val="fr-FR"/>
+        </w:rPr>
+        <w:t xml:space="preserve"> </w:t>
+      </w:r>
+      <w:proofErr w:type="gramStart"/>
+      <w:r>
+        <w:rPr>
+          <w:rFonts w:ascii="AppleSystemUIFont" w:hAnsi="AppleSystemUIFont" w:cs="AppleSystemUIFont"/>
+          <w:color w:val="0070C0"/>
+          <w:kern w:val="0"/>
+          <w:lang w:val="fr-FR"/>
+        </w:rPr>
+        <w:t>a</w:t>
+      </w:r>
+      <w:proofErr w:type="gramEnd"/>
+      <w:r>
+        <w:rPr>
+          <w:rFonts w:ascii="AppleSystemUIFont" w:hAnsi="AppleSystemUIFont" w:cs="AppleSystemUIFont"/>
+          <w:color w:val="0070C0"/>
+          <w:kern w:val="0"/>
+          <w:lang w:val="fr-FR"/>
+        </w:rPr>
+        <w:t xml:space="preserve"> user </w:t>
+      </w:r>
+      <w:proofErr w:type="spellStart"/>
+      <w:r>
+        <w:rPr>
+          <w:rFonts w:ascii="AppleSystemUIFont" w:hAnsi="AppleSystemUIFont" w:cs="AppleSystemUIFont"/>
+          <w:color w:val="0070C0"/>
+          <w:kern w:val="0"/>
+          <w:lang w:val="fr-FR"/>
+        </w:rPr>
+        <w:t>wants</w:t>
+      </w:r>
+      <w:proofErr w:type="spellEnd"/>
+      <w:r>
+        <w:rPr>
+          <w:rFonts w:ascii="AppleSystemUIFont" w:hAnsi="AppleSystemUIFont" w:cs="AppleSystemUIFont"/>
+          <w:color w:val="0070C0"/>
+          <w:kern w:val="0"/>
+          <w:lang w:val="fr-FR"/>
+        </w:rPr>
+        <w:t xml:space="preserve"> to </w:t>
+      </w:r>
+      <w:proofErr w:type="spellStart"/>
+      <w:r>
+        <w:rPr>
+          <w:rFonts w:ascii="AppleSystemUIFont" w:hAnsi="AppleSystemUIFont" w:cs="AppleSystemUIFont"/>
+          <w:color w:val="0070C0"/>
+          <w:kern w:val="0"/>
+          <w:lang w:val="fr-FR"/>
+        </w:rPr>
+        <w:t>verify</w:t>
+      </w:r>
+      <w:proofErr w:type="spellEnd"/>
+      <w:r>
+        <w:rPr>
+          <w:rFonts w:ascii="AppleSystemUIFont" w:hAnsi="AppleSystemUIFont" w:cs="AppleSystemUIFont"/>
+          <w:color w:val="0070C0"/>
+          <w:kern w:val="0"/>
+          <w:lang w:val="fr-FR"/>
+        </w:rPr>
+        <w:t xml:space="preserve"> </w:t>
+      </w:r>
+      <w:proofErr w:type="spellStart"/>
+      <w:r>
+        <w:rPr>
+          <w:rFonts w:ascii="AppleSystemUIFont" w:hAnsi="AppleSystemUIFont" w:cs="AppleSystemUIFont"/>
+          <w:color w:val="0070C0"/>
+          <w:kern w:val="0"/>
+          <w:lang w:val="fr-FR"/>
+        </w:rPr>
+        <w:t>authenticity</w:t>
+      </w:r>
+      <w:proofErr w:type="spellEnd"/>
+      <w:r>
+        <w:rPr>
+          <w:rFonts w:ascii="AppleSystemUIFont" w:hAnsi="AppleSystemUIFont" w:cs="AppleSystemUIFont"/>
+          <w:color w:val="0070C0"/>
+          <w:kern w:val="0"/>
+          <w:lang w:val="fr-FR"/>
         </w:rPr>
         <w:t>…</w:t>
       </w:r>
@@ -2096,7 +2107,7 @@
           <w:rFonts w:ascii="AppleSystemUIFont" w:hAnsi="AppleSystemUIFont" w:cs="AppleSystemUIFont"/>
           <w:color w:val="0070C0"/>
           <w:kern w:val="0"/>
-          <w:lang w:val="en-US"/>
+          <w:lang w:val="fr-FR"/>
         </w:rPr>
         <w:t>)</w:t>
       </w:r>
@@ -2105,7 +2116,7 @@
           <w:rFonts w:ascii="AppleSystemUIFont" w:hAnsi="AppleSystemUIFont" w:cs="AppleSystemUIFont"/>
           <w:color w:val="0070C0"/>
           <w:kern w:val="0"/>
-          <w:lang w:val="en-US"/>
+          <w:lang w:val="fr-FR"/>
         </w:rPr>
         <w:t>.</w:t>
       </w:r>
@@ -2114,7 +2125,7 @@
           <w:rFonts w:ascii="AppleSystemUIFont" w:hAnsi="AppleSystemUIFont" w:cs="AppleSystemUIFont"/>
           <w:color w:val="0070C0"/>
           <w:kern w:val="0"/>
-          <w:lang w:val="en-US"/>
+          <w:lang w:val="fr-FR"/>
         </w:rPr>
         <w:t xml:space="preserve"> </w:t>
       </w:r>
@@ -2187,16 +2198,7 @@
           <w:kern w:val="0"/>
           <w:lang w:val="fr-FR"/>
         </w:rPr>
-        <w:t xml:space="preserve">missibilité juridique </w:t>
-      </w:r>
-      <w:r>
-        <w:rPr>
-          <w:rFonts w:ascii="AppleSystemUIFont" w:hAnsi="AppleSystemUIFont" w:cs="AppleSystemUIFont"/>
-          <w:color w:val="0070C0"/>
-          <w:kern w:val="0"/>
-          <w:lang w:val="fr-FR"/>
-        </w:rPr>
-        <w:t xml:space="preserve">de </w:t>
+        <w:t xml:space="preserve">missibilité juridique de </w:t>
       </w:r>
       <w:r>
         <w:rPr>
@@ -2214,16 +2216,7 @@
           <w:kern w:val="0"/>
           <w:lang w:val="fr-FR"/>
         </w:rPr>
-        <w:t>’</w:t>
-      </w:r>
-      <w:r>
-        <w:rPr>
-          <w:rFonts w:ascii="AppleSystemUIFont" w:hAnsi="AppleSystemUIFont" w:cs="AppleSystemUIFont"/>
-          <w:color w:val="0070C0"/>
-          <w:kern w:val="0"/>
-          <w:lang w:val="fr-FR"/>
-        </w:rPr>
-        <w:t>horodatage</w:t>
+        <w:t>’horodatage</w:t>
       </w:r>
       <w:r>
         <w:rPr>
@@ -2268,16 +2261,7 @@
           <w:kern w:val="0"/>
           <w:lang w:val="fr-FR"/>
         </w:rPr>
-        <w:t>n'est pas analysée</w:t>
-      </w:r>
-      <w:r>
-        <w:rPr>
-          <w:rFonts w:ascii="AppleSystemUIFont" w:hAnsi="AppleSystemUIFont" w:cs="AppleSystemUIFont"/>
-          <w:color w:val="0070C0"/>
-          <w:kern w:val="0"/>
-          <w:lang w:val="fr-FR"/>
-        </w:rPr>
-        <w:t xml:space="preserve">, toutefois </w:t>
+        <w:t xml:space="preserve">n'est pas analysée, toutefois </w:t>
       </w:r>
       <w:r>
         <w:rPr>
@@ -2366,17 +2350,7 @@
           <w:kern w:val="0"/>
           <w:lang w:val="en-US"/>
         </w:rPr>
-        <w:t>En</w:t>
-      </w:r>
-      <w:r>
-        <w:rPr>
-          <w:rFonts w:ascii="AppleSystemUIFont" w:hAnsi="AppleSystemUIFont" w:cs="AppleSystemUIFont"/>
-          <w:b/>
-          <w:bCs/>
-          <w:kern w:val="0"/>
-          <w:lang w:val="en-US"/>
-        </w:rPr>
-        <w:t> </w:t>
+        <w:t>En </w:t>
       </w:r>
       <w:r>
         <w:rPr>
@@ -3569,15 +3543,7 @@
                 <w:sz w:val="18"/>
                 <w:szCs w:val="18"/>
               </w:rPr>
-              <w:t>blockchain</w:t>
-            </w:r>
-            <w:r>
-              <w:rPr>
-                <w:color w:val="0070C0"/>
-                <w:sz w:val="18"/>
-                <w:szCs w:val="18"/>
-              </w:rPr>
-              <w:t xml:space="preserve"> </w:t>
+              <w:t xml:space="preserve">blockchain </w:t>
             </w:r>
             <w:r>
               <w:rPr>
@@ -5394,16 +5360,7 @@
                 <w:sz w:val="18"/>
                 <w:szCs w:val="18"/>
               </w:rPr>
-              <w:t>combinée</w:t>
-            </w:r>
-            <w:r>
-              <w:rPr>
-                <w:strike/>
-                <w:color w:val="0070C0"/>
-                <w:sz w:val="18"/>
-                <w:szCs w:val="18"/>
-              </w:rPr>
-              <w:t xml:space="preserve"> à </w:t>
+              <w:t xml:space="preserve">combinée à </w:t>
             </w:r>
             <w:r>
               <w:rPr>
@@ -14191,7 +14148,7 @@
           <w:kern w:val="0"/>
           <w:lang w:val="fr-FR"/>
         </w:rPr>
-        <w:t>basPage1</w:t>
+        <w:t>basPage1)</w:t>
       </w:r>
       <w:r>
         <w:rPr>
@@ -14200,8 +14157,9 @@
           <w:kern w:val="0"/>
           <w:lang w:val="fr-FR"/>
         </w:rPr>
-        <w:t>)</w:t>
-      </w:r>
+        <w:t>https://www.xe.com/fr/currencyconverter/convert/?Amount=0.0005168205083614&amp;From=ETH&amp;To=USD</w:t>
+      </w:r>
+      <w:proofErr w:type="gramEnd"/>
       <w:r>
         <w:rPr>
           <w:rFonts w:ascii="AppleSystemUIFont" w:hAnsi="AppleSystemUIFont" w:cs="AppleSystemUIFont"/>
@@ -14209,26 +14167,7 @@
           <w:kern w:val="0"/>
           <w:lang w:val="fr-FR"/>
         </w:rPr>
-        <w:t>https://www.xe.com/fr/currencyconverter/convert/?Amount=0.0005168205083614&amp;From=ETH&amp;To=USD</w:t>
-      </w:r>
-      <w:proofErr w:type="gramEnd"/>
-      <w:r>
-        <w:rPr>
-          <w:rFonts w:ascii="AppleSystemUIFont" w:hAnsi="AppleSystemUIFont" w:cs="AppleSystemUIFont"/>
-          <w:color w:val="FF0000"/>
-          <w:kern w:val="0"/>
-          <w:lang w:val="fr-FR"/>
-        </w:rPr>
-        <w:t xml:space="preserve"> le 25/02/2026</w:t>
-      </w:r>
-      <w:r>
-        <w:rPr>
-          <w:rFonts w:ascii="AppleSystemUIFont" w:hAnsi="AppleSystemUIFont" w:cs="AppleSystemUIFont"/>
-          <w:color w:val="FF0000"/>
-          <w:kern w:val="0"/>
-          <w:lang w:val="fr-FR"/>
-        </w:rPr>
-        <w:t xml:space="preserve"> </w:t>
+        <w:t xml:space="preserve"> le 25/02/2026 </w:t>
       </w:r>
     </w:p>
     <w:p>
@@ -14871,13 +14810,11 @@
           <w:lang w:val="fr-FR"/>
         </w:rPr>
       </w:pPr>
-      <w:proofErr w:type="spellStart"/>
-      <w:proofErr w:type="gramStart"/>
-      <w:r>
-        <w:rPr>
-          <w:rFonts w:ascii="AppleSystemUIFont" w:hAnsi="AppleSystemUIFont" w:cs="AppleSystemUIFont"/>
-          <w:kern w:val="0"/>
-          <w:lang w:val="en-US"/>
+      <w:r>
+        <w:rPr>
+          <w:rFonts w:ascii="AppleSystemUIFont" w:hAnsi="AppleSystemUIFont" w:cs="AppleSystemUIFont"/>
+          <w:kern w:val="0"/>
+          <w:lang w:val="fr-FR"/>
         </w:rPr>
         <w:lastRenderedPageBreak/>
         <w:t>Échantillon</w:t>
@@ -14886,53 +14823,25 @@
         <w:rPr>
           <w:rFonts w:ascii="AppleSystemUIFont" w:hAnsi="AppleSystemUIFont" w:cs="AppleSystemUIFont"/>
           <w:kern w:val="0"/>
-          <w:lang w:val="en-US"/>
+          <w:lang w:val="fr-FR"/>
         </w:rPr>
         <w:t>nage</w:t>
       </w:r>
-      <w:proofErr w:type="spellEnd"/>
-      <w:r>
-        <w:rPr>
-          <w:rFonts w:ascii="AppleSystemUIFont" w:hAnsi="AppleSystemUIFont" w:cs="AppleSystemUIFont"/>
-          <w:kern w:val="0"/>
-          <w:lang w:val="en-US"/>
-        </w:rPr>
-        <w:t> :</w:t>
-      </w:r>
-      <w:proofErr w:type="gramEnd"/>
-      <w:r>
-        <w:rPr>
-          <w:rFonts w:ascii="AppleSystemUIFont" w:hAnsi="AppleSystemUIFont" w:cs="AppleSystemUIFont"/>
-          <w:kern w:val="0"/>
-          <w:lang w:val="en-US"/>
-        </w:rPr>
-        <w:t xml:space="preserve"> </w:t>
-      </w:r>
-      <w:r>
-        <w:rPr>
-          <w:rFonts w:ascii="AppleSystemUIFont" w:hAnsi="AppleSystemUIFont" w:cs="AppleSystemUIFont"/>
-          <w:kern w:val="0"/>
-          <w:lang w:val="en-US"/>
-        </w:rPr>
-        <w:t xml:space="preserve">50000 </w:t>
-      </w:r>
-      <w:proofErr w:type="gramStart"/>
-      <w:r>
-        <w:rPr>
-          <w:rFonts w:ascii="AppleSystemUIFont" w:hAnsi="AppleSystemUIFont" w:cs="AppleSystemUIFont"/>
-          <w:kern w:val="0"/>
-          <w:lang w:val="en-US"/>
-        </w:rPr>
-        <w:t>doc</w:t>
-      </w:r>
-      <w:proofErr w:type="gramEnd"/>
-      <w:r>
-        <w:rPr>
-          <w:rFonts w:ascii="AppleSystemUIFont" w:hAnsi="AppleSystemUIFont" w:cs="AppleSystemUIFont"/>
-          <w:kern w:val="0"/>
-          <w:lang w:val="en-US"/>
-        </w:rPr>
-        <w:t xml:space="preserve"> (hash). </w:t>
+      <w:r>
+        <w:rPr>
+          <w:rFonts w:ascii="AppleSystemUIFont" w:hAnsi="AppleSystemUIFont" w:cs="AppleSystemUIFont"/>
+          <w:kern w:val="0"/>
+          <w:lang w:val="fr-FR"/>
+        </w:rPr>
+        <w:t xml:space="preserve"> : </w:t>
+      </w:r>
+      <w:r>
+        <w:rPr>
+          <w:rFonts w:ascii="AppleSystemUIFont" w:hAnsi="AppleSystemUIFont" w:cs="AppleSystemUIFont"/>
+          <w:kern w:val="0"/>
+          <w:lang w:val="fr-FR"/>
+        </w:rPr>
+        <w:t xml:space="preserve">50000 doc (hash). </w:t>
       </w:r>
       <w:r>
         <w:rPr>
@@ -16331,6 +16240,21 @@
               </w:rPr>
               <w:t>Tableau T2</w:t>
             </w:r>
+            <w:r>
+              <w:rPr>
+                <w:b/>
+                <w:bCs/>
+              </w:rPr>
+              <w:t xml:space="preserve"> : </w:t>
+            </w:r>
+            <w:r>
+              <w:rPr>
+                <w:rFonts w:ascii="AppleSystemUIFont" w:hAnsi="AppleSystemUIFont" w:cs="AppleSystemUIFont"/>
+                <w:kern w:val="0"/>
+                <w:lang w:val="fr-FR"/>
+              </w:rPr>
+              <w:t>tests d’intégrité de fichier</w:t>
+            </w:r>
           </w:p>
         </w:tc>
       </w:tr>
@@ -16412,7 +16336,14 @@
                 <w:b/>
                 <w:bCs/>
               </w:rPr>
-              <w:t>Paramètre expérimental</w:t>
+              <w:t>Action</w:t>
+            </w:r>
+            <w:r>
+              <w:rPr>
+                <w:b/>
+                <w:bCs/>
+              </w:rPr>
+              <w:t xml:space="preserve"> expérimental</w:t>
             </w:r>
           </w:p>
         </w:tc>
@@ -16456,7 +16387,15 @@
                 <w:b/>
                 <w:bCs/>
               </w:rPr>
-              <w:t>de stocker à nouveau le doc</w:t>
+              <w:t xml:space="preserve">de stocker à nouveau le </w:t>
+            </w:r>
+            <w:r>
+              <w:rPr>
+                <w:rFonts w:ascii="AppleSystemUIFont" w:hAnsi="AppleSystemUIFont" w:cs="AppleSystemUIFont"/>
+                <w:kern w:val="0"/>
+                <w:lang w:val="fr-FR"/>
+              </w:rPr>
+              <w:t>document</w:t>
             </w:r>
           </w:p>
         </w:tc>
@@ -16479,7 +16418,29 @@
                 <w:b/>
                 <w:bCs/>
               </w:rPr>
-              <w:t>Est-ce un doc authentique</w:t>
+              <w:t xml:space="preserve">Est-ce un </w:t>
+            </w:r>
+            <w:r>
+              <w:rPr>
+                <w:rFonts w:ascii="AppleSystemUIFont" w:hAnsi="AppleSystemUIFont" w:cs="AppleSystemUIFont"/>
+                <w:kern w:val="0"/>
+                <w:lang w:val="fr-FR"/>
+              </w:rPr>
+              <w:t>document</w:t>
+            </w:r>
+            <w:r>
+              <w:rPr>
+                <w:b/>
+                <w:bCs/>
+              </w:rPr>
+              <w:t xml:space="preserve"> </w:t>
+            </w:r>
+            <w:r>
+              <w:rPr>
+                <w:b/>
+                <w:bCs/>
+              </w:rPr>
+              <w:t>intègre</w:t>
             </w:r>
           </w:p>
         </w:tc>
@@ -16502,7 +16463,7 @@
                 <w:b/>
                 <w:bCs/>
               </w:rPr>
-              <w:t>Observation / Conclusion</w:t>
+              <w:t>Observation</w:t>
             </w:r>
           </w:p>
         </w:tc>
@@ -16633,79 +16594,127 @@
               <w:rPr>
                 <w:rFonts w:ascii="AppleSystemUIFont" w:hAnsi="AppleSystemUIFont" w:cs="AppleSystemUIFont"/>
                 <w:kern w:val="0"/>
-                <w:lang w:val="en-US"/>
+                <w:lang w:val="fr-FR"/>
               </w:rPr>
             </w:pPr>
             <w:proofErr w:type="gramStart"/>
             <w:r>
-              <w:rPr>
-                <w:rFonts w:ascii="AppleSystemUIFont" w:hAnsi="AppleSystemUIFont" w:cs="AppleSystemUIFont"/>
-                <w:kern w:val="0"/>
-                <w:lang w:val="en-US"/>
-              </w:rPr>
-              <w:t>Hash(</w:t>
-            </w:r>
-            <w:proofErr w:type="gramEnd"/>
-            <w:r>
-              <w:rPr>
-                <w:rFonts w:ascii="AppleSystemUIFont" w:hAnsi="AppleSystemUIFont" w:cs="AppleSystemUIFont"/>
-                <w:kern w:val="0"/>
-                <w:lang w:val="en-US"/>
-              </w:rPr>
-              <w:t xml:space="preserve">doc original) = </w:t>
-            </w:r>
-            <w:proofErr w:type="gramStart"/>
-            <w:r>
-              <w:rPr>
-                <w:rFonts w:ascii="AppleSystemUIFont" w:hAnsi="AppleSystemUIFont" w:cs="AppleSystemUIFont"/>
-                <w:kern w:val="0"/>
-                <w:lang w:val="en-US"/>
-              </w:rPr>
-              <w:t>Hash(</w:t>
-            </w:r>
-            <w:proofErr w:type="gramEnd"/>
-            <w:r>
-              <w:rPr>
-                <w:rFonts w:ascii="AppleSystemUIFont" w:hAnsi="AppleSystemUIFont" w:cs="AppleSystemUIFont"/>
-                <w:kern w:val="0"/>
-                <w:lang w:val="en-US"/>
-              </w:rPr>
-              <w:t xml:space="preserve">doc </w:t>
-            </w:r>
-            <w:proofErr w:type="spellStart"/>
-            <w:r>
-              <w:rPr>
-                <w:rFonts w:ascii="AppleSystemUIFont" w:hAnsi="AppleSystemUIFont" w:cs="AppleSystemUIFont"/>
-                <w:kern w:val="0"/>
-                <w:lang w:val="en-US"/>
-              </w:rPr>
-              <w:t>transféré</w:t>
-            </w:r>
-            <w:proofErr w:type="spellEnd"/>
-            <w:r>
-              <w:rPr>
-                <w:rFonts w:ascii="AppleSystemUIFont" w:hAnsi="AppleSystemUIFont" w:cs="AppleSystemUIFont"/>
-                <w:kern w:val="0"/>
-                <w:lang w:val="en-US"/>
-              </w:rPr>
-              <w:t xml:space="preserve">). </w:t>
-            </w:r>
-          </w:p>
-          <w:p>
-            <w:pPr>
               <w:rPr>
                 <w:rFonts w:ascii="AppleSystemUIFont" w:hAnsi="AppleSystemUIFont" w:cs="AppleSystemUIFont"/>
                 <w:kern w:val="0"/>
                 <w:lang w:val="fr-FR"/>
               </w:rPr>
-            </w:pPr>
+              <w:t>Hash(</w:t>
+            </w:r>
+            <w:proofErr w:type="gramEnd"/>
             <w:r>
               <w:rPr>
                 <w:rFonts w:ascii="AppleSystemUIFont" w:hAnsi="AppleSystemUIFont" w:cs="AppleSystemUIFont"/>
                 <w:kern w:val="0"/>
                 <w:lang w:val="fr-FR"/>
               </w:rPr>
-              <w:t>L’unicité ou l’intégrité des doc basée sur l’</w:t>
+              <w:t>document</w:t>
+            </w:r>
+            <w:r>
+              <w:rPr>
+                <w:rFonts w:ascii="AppleSystemUIFont" w:hAnsi="AppleSystemUIFont" w:cs="AppleSystemUIFont"/>
+                <w:kern w:val="0"/>
+                <w:lang w:val="fr-FR"/>
+              </w:rPr>
+              <w:t xml:space="preserve"> </w:t>
+            </w:r>
+            <w:r>
+              <w:rPr>
+                <w:rFonts w:ascii="AppleSystemUIFont" w:hAnsi="AppleSystemUIFont" w:cs="AppleSystemUIFont"/>
+                <w:kern w:val="0"/>
+                <w:lang w:val="fr-FR"/>
+              </w:rPr>
+              <w:t xml:space="preserve">original) = </w:t>
+            </w:r>
+            <w:proofErr w:type="gramStart"/>
+            <w:r>
+              <w:rPr>
+                <w:rFonts w:ascii="AppleSystemUIFont" w:hAnsi="AppleSystemUIFont" w:cs="AppleSystemUIFont"/>
+                <w:kern w:val="0"/>
+                <w:lang w:val="fr-FR"/>
+              </w:rPr>
+              <w:t>Hash(</w:t>
+            </w:r>
+            <w:proofErr w:type="gramEnd"/>
+            <w:r>
+              <w:rPr>
+                <w:rFonts w:ascii="AppleSystemUIFont" w:hAnsi="AppleSystemUIFont" w:cs="AppleSystemUIFont"/>
+                <w:kern w:val="0"/>
+                <w:lang w:val="fr-FR"/>
+              </w:rPr>
+              <w:t>document</w:t>
+            </w:r>
+            <w:r>
+              <w:rPr>
+                <w:rFonts w:ascii="AppleSystemUIFont" w:hAnsi="AppleSystemUIFont" w:cs="AppleSystemUIFont"/>
+                <w:kern w:val="0"/>
+                <w:lang w:val="fr-FR"/>
+              </w:rPr>
+              <w:t xml:space="preserve"> </w:t>
+            </w:r>
+            <w:r>
+              <w:rPr>
+                <w:rFonts w:ascii="AppleSystemUIFont" w:hAnsi="AppleSystemUIFont" w:cs="AppleSystemUIFont"/>
+                <w:kern w:val="0"/>
+                <w:lang w:val="fr-FR"/>
+              </w:rPr>
+              <w:t xml:space="preserve">transféré). </w:t>
+            </w:r>
+          </w:p>
+          <w:p>
+            <w:pPr>
+              <w:rPr>
+                <w:rFonts w:ascii="AppleSystemUIFont" w:hAnsi="AppleSystemUIFont" w:cs="AppleSystemUIFont"/>
+                <w:kern w:val="0"/>
+                <w:lang w:val="fr-FR"/>
+              </w:rPr>
+            </w:pPr>
+            <w:r>
+              <w:rPr>
+                <w:rFonts w:ascii="AppleSystemUIFont" w:hAnsi="AppleSystemUIFont" w:cs="AppleSystemUIFont"/>
+                <w:kern w:val="0"/>
+                <w:lang w:val="fr-FR"/>
+              </w:rPr>
+              <w:t xml:space="preserve">L’intégrité </w:t>
+            </w:r>
+            <w:proofErr w:type="gramStart"/>
+            <w:r>
+              <w:rPr>
+                <w:rFonts w:ascii="AppleSystemUIFont" w:hAnsi="AppleSystemUIFont" w:cs="AppleSystemUIFont"/>
+                <w:kern w:val="0"/>
+                <w:lang w:val="fr-FR"/>
+              </w:rPr>
+              <w:t xml:space="preserve">des </w:t>
+            </w:r>
+            <w:r>
+              <w:rPr>
+                <w:rFonts w:ascii="AppleSystemUIFont" w:hAnsi="AppleSystemUIFont" w:cs="AppleSystemUIFont"/>
+                <w:kern w:val="0"/>
+                <w:lang w:val="fr-FR"/>
+              </w:rPr>
+              <w:t>document</w:t>
+            </w:r>
+            <w:proofErr w:type="gramEnd"/>
+            <w:r>
+              <w:rPr>
+                <w:rFonts w:ascii="AppleSystemUIFont" w:hAnsi="AppleSystemUIFont" w:cs="AppleSystemUIFont"/>
+                <w:kern w:val="0"/>
+                <w:lang w:val="fr-FR"/>
+              </w:rPr>
+              <w:t xml:space="preserve"> </w:t>
+            </w:r>
+            <w:r>
+              <w:rPr>
+                <w:rFonts w:ascii="AppleSystemUIFont" w:hAnsi="AppleSystemUIFont" w:cs="AppleSystemUIFont"/>
+                <w:kern w:val="0"/>
+                <w:lang w:val="fr-FR"/>
+              </w:rPr>
+              <w:t>basée sur l’</w:t>
             </w:r>
             <w:r>
               <w:rPr>
@@ -16836,27 +16845,51 @@
               <w:rPr>
                 <w:rFonts w:ascii="AppleSystemUIFont" w:hAnsi="AppleSystemUIFont" w:cs="AppleSystemUIFont"/>
                 <w:kern w:val="0"/>
-                <w:lang w:val="en-US"/>
-              </w:rPr>
-              <w:t xml:space="preserve">doc original) = </w:t>
-            </w:r>
-            <w:proofErr w:type="gramStart"/>
+                <w:lang w:val="fr-FR"/>
+              </w:rPr>
+              <w:t>document</w:t>
+            </w:r>
             <w:r>
               <w:rPr>
                 <w:rFonts w:ascii="AppleSystemUIFont" w:hAnsi="AppleSystemUIFont" w:cs="AppleSystemUIFont"/>
                 <w:kern w:val="0"/>
                 <w:lang w:val="en-US"/>
               </w:rPr>
-              <w:t>Hash(</w:t>
-            </w:r>
-            <w:proofErr w:type="gramEnd"/>
+              <w:t xml:space="preserve"> </w:t>
+            </w:r>
             <w:r>
               <w:rPr>
                 <w:rFonts w:ascii="AppleSystemUIFont" w:hAnsi="AppleSystemUIFont" w:cs="AppleSystemUIFont"/>
                 <w:kern w:val="0"/>
                 <w:lang w:val="en-US"/>
               </w:rPr>
-              <w:t xml:space="preserve">doc </w:t>
+              <w:t xml:space="preserve">original) = </w:t>
+            </w:r>
+            <w:proofErr w:type="gramStart"/>
+            <w:r>
+              <w:rPr>
+                <w:rFonts w:ascii="AppleSystemUIFont" w:hAnsi="AppleSystemUIFont" w:cs="AppleSystemUIFont"/>
+                <w:kern w:val="0"/>
+                <w:lang w:val="en-US"/>
+              </w:rPr>
+              <w:t>Hash(</w:t>
+            </w:r>
+            <w:proofErr w:type="gramEnd"/>
+            <w:r>
+              <w:rPr>
+                <w:rFonts w:ascii="AppleSystemUIFont" w:hAnsi="AppleSystemUIFont" w:cs="AppleSystemUIFont"/>
+                <w:kern w:val="0"/>
+                <w:lang w:val="fr-FR"/>
+              </w:rPr>
+              <w:t>document</w:t>
+            </w:r>
+            <w:r>
+              <w:rPr>
+                <w:rFonts w:ascii="AppleSystemUIFont" w:hAnsi="AppleSystemUIFont" w:cs="AppleSystemUIFont"/>
+                <w:kern w:val="0"/>
+                <w:lang w:val="en-US"/>
+              </w:rPr>
+              <w:t xml:space="preserve"> </w:t>
             </w:r>
             <w:proofErr w:type="spellStart"/>
             <w:r>
@@ -16997,87 +17030,149 @@
               <w:rPr>
                 <w:rFonts w:ascii="AppleSystemUIFont" w:hAnsi="AppleSystemUIFont" w:cs="AppleSystemUIFont"/>
                 <w:kern w:val="0"/>
-                <w:lang w:val="en-US"/>
+                <w:lang w:val="fr-FR"/>
               </w:rPr>
             </w:pPr>
             <w:proofErr w:type="gramStart"/>
             <w:r>
-              <w:rPr>
-                <w:rFonts w:ascii="AppleSystemUIFont" w:hAnsi="AppleSystemUIFont" w:cs="AppleSystemUIFont"/>
-                <w:kern w:val="0"/>
-                <w:lang w:val="en-US"/>
-              </w:rPr>
-              <w:t>Hash(</w:t>
-            </w:r>
-            <w:proofErr w:type="gramEnd"/>
-            <w:r>
-              <w:rPr>
-                <w:rFonts w:ascii="AppleSystemUIFont" w:hAnsi="AppleSystemUIFont" w:cs="AppleSystemUIFont"/>
-                <w:kern w:val="0"/>
-                <w:lang w:val="en-US"/>
-              </w:rPr>
-              <w:t xml:space="preserve">doc original) </w:t>
-            </w:r>
-            <w:r>
-              <w:rPr>
-                <w:rFonts w:ascii="AppleSystemUIFont" w:hAnsi="AppleSystemUIFont" w:cs="AppleSystemUIFont"/>
-                <w:kern w:val="0"/>
-                <w:lang w:val="en-US"/>
-              </w:rPr>
-              <w:t xml:space="preserve">≠ </w:t>
-            </w:r>
-            <w:proofErr w:type="gramStart"/>
-            <w:r>
-              <w:rPr>
-                <w:rFonts w:ascii="AppleSystemUIFont" w:hAnsi="AppleSystemUIFont" w:cs="AppleSystemUIFont"/>
-                <w:kern w:val="0"/>
-                <w:lang w:val="en-US"/>
-              </w:rPr>
-              <w:t>Hash(</w:t>
-            </w:r>
-            <w:proofErr w:type="gramEnd"/>
-            <w:r>
-              <w:rPr>
-                <w:rFonts w:ascii="AppleSystemUIFont" w:hAnsi="AppleSystemUIFont" w:cs="AppleSystemUIFont"/>
-                <w:kern w:val="0"/>
-                <w:lang w:val="en-US"/>
-              </w:rPr>
-              <w:t xml:space="preserve">doc </w:t>
-            </w:r>
-            <w:proofErr w:type="spellStart"/>
-            <w:r>
-              <w:rPr>
-                <w:rFonts w:ascii="AppleSystemUIFont" w:hAnsi="AppleSystemUIFont" w:cs="AppleSystemUIFont"/>
-                <w:kern w:val="0"/>
-                <w:lang w:val="en-US"/>
-              </w:rPr>
-              <w:t>transféré</w:t>
-            </w:r>
-            <w:proofErr w:type="spellEnd"/>
-            <w:r>
-              <w:rPr>
-                <w:rFonts w:ascii="AppleSystemUIFont" w:hAnsi="AppleSystemUIFont" w:cs="AppleSystemUIFont"/>
-                <w:kern w:val="0"/>
-                <w:lang w:val="en-US"/>
-              </w:rPr>
-              <w:t xml:space="preserve">). </w:t>
-            </w:r>
-          </w:p>
-          <w:p>
-            <w:pPr>
               <w:rPr>
                 <w:rFonts w:ascii="AppleSystemUIFont" w:hAnsi="AppleSystemUIFont" w:cs="AppleSystemUIFont"/>
                 <w:kern w:val="0"/>
                 <w:lang w:val="fr-FR"/>
               </w:rPr>
-            </w:pPr>
+              <w:t>Hash(</w:t>
+            </w:r>
+            <w:proofErr w:type="gramEnd"/>
             <w:r>
               <w:rPr>
                 <w:rFonts w:ascii="AppleSystemUIFont" w:hAnsi="AppleSystemUIFont" w:cs="AppleSystemUIFont"/>
                 <w:kern w:val="0"/>
                 <w:lang w:val="fr-FR"/>
               </w:rPr>
-              <w:t>Le fichier binaire compressé n’est pas identique au fichier binaire initial (hash différents) même si le contenu semble identique. Cela est dû au fait qu’après compression, la structure interne du fichier, son encodage, ses métadonnées (auteur, dates création/dernière modification, logiciel utilisé, etc.) et même l’ordre des objets connaissent des modifications.</w:t>
+              <w:t>document</w:t>
+            </w:r>
+            <w:r>
+              <w:rPr>
+                <w:rFonts w:ascii="AppleSystemUIFont" w:hAnsi="AppleSystemUIFont" w:cs="AppleSystemUIFont"/>
+                <w:kern w:val="0"/>
+                <w:lang w:val="fr-FR"/>
+              </w:rPr>
+              <w:t xml:space="preserve"> </w:t>
+            </w:r>
+            <w:r>
+              <w:rPr>
+                <w:rFonts w:ascii="AppleSystemUIFont" w:hAnsi="AppleSystemUIFont" w:cs="AppleSystemUIFont"/>
+                <w:kern w:val="0"/>
+                <w:lang w:val="fr-FR"/>
+              </w:rPr>
+              <w:t xml:space="preserve">original) ≠ </w:t>
+            </w:r>
+            <w:proofErr w:type="gramStart"/>
+            <w:r>
+              <w:rPr>
+                <w:rFonts w:ascii="AppleSystemUIFont" w:hAnsi="AppleSystemUIFont" w:cs="AppleSystemUIFont"/>
+                <w:kern w:val="0"/>
+                <w:lang w:val="fr-FR"/>
+              </w:rPr>
+              <w:t>Hash(</w:t>
+            </w:r>
+            <w:proofErr w:type="gramEnd"/>
+            <w:r>
+              <w:rPr>
+                <w:rFonts w:ascii="AppleSystemUIFont" w:hAnsi="AppleSystemUIFont" w:cs="AppleSystemUIFont"/>
+                <w:kern w:val="0"/>
+                <w:lang w:val="fr-FR"/>
+              </w:rPr>
+              <w:t>document</w:t>
+            </w:r>
+            <w:r>
+              <w:rPr>
+                <w:rFonts w:ascii="AppleSystemUIFont" w:hAnsi="AppleSystemUIFont" w:cs="AppleSystemUIFont"/>
+                <w:kern w:val="0"/>
+                <w:lang w:val="fr-FR"/>
+              </w:rPr>
+              <w:t xml:space="preserve"> </w:t>
+            </w:r>
+            <w:r>
+              <w:rPr>
+                <w:rFonts w:ascii="AppleSystemUIFont" w:hAnsi="AppleSystemUIFont" w:cs="AppleSystemUIFont"/>
+                <w:kern w:val="0"/>
+                <w:lang w:val="fr-FR"/>
+              </w:rPr>
+              <w:t>compressé</w:t>
+            </w:r>
+            <w:r>
+              <w:rPr>
+                <w:rFonts w:ascii="AppleSystemUIFont" w:hAnsi="AppleSystemUIFont" w:cs="AppleSystemUIFont"/>
+                <w:kern w:val="0"/>
+                <w:lang w:val="fr-FR"/>
+              </w:rPr>
+              <w:t xml:space="preserve">). </w:t>
+            </w:r>
+          </w:p>
+          <w:p>
+            <w:pPr>
+              <w:rPr>
+                <w:rFonts w:ascii="AppleSystemUIFont" w:hAnsi="AppleSystemUIFont" w:cs="AppleSystemUIFont"/>
+                <w:kern w:val="0"/>
+                <w:lang w:val="fr-FR"/>
+              </w:rPr>
+            </w:pPr>
+            <w:r>
+              <w:rPr>
+                <w:rFonts w:ascii="AppleSystemUIFont" w:hAnsi="AppleSystemUIFont" w:cs="AppleSystemUIFont"/>
+                <w:kern w:val="0"/>
+                <w:lang w:val="fr-FR"/>
+              </w:rPr>
+              <w:t xml:space="preserve">Le fichier binaire compressé n’est pas identique au fichier binaire initial (hash différents) même si le contenu semble identique. </w:t>
+            </w:r>
+            <w:r>
+              <w:rPr>
+                <w:rFonts w:ascii="AppleSystemUIFont" w:hAnsi="AppleSystemUIFont" w:cs="AppleSystemUIFont"/>
+                <w:kern w:val="0"/>
+                <w:lang w:val="fr-FR"/>
+              </w:rPr>
+              <w:t>A</w:t>
+            </w:r>
+            <w:r>
+              <w:rPr>
+                <w:rFonts w:ascii="AppleSystemUIFont" w:hAnsi="AppleSystemUIFont" w:cs="AppleSystemUIFont"/>
+                <w:kern w:val="0"/>
+                <w:lang w:val="fr-FR"/>
+              </w:rPr>
+              <w:t xml:space="preserve">près compression, la structure interne du fichier, son encodage, ses métadonnées (auteur, dates création/dernière modification, logiciel utilisé, etc.) et même l’ordre des objets </w:t>
+            </w:r>
+            <w:r>
+              <w:rPr>
+                <w:rFonts w:ascii="AppleSystemUIFont" w:hAnsi="AppleSystemUIFont" w:cs="AppleSystemUIFont"/>
+                <w:kern w:val="0"/>
+                <w:lang w:val="fr-FR"/>
+              </w:rPr>
+              <w:t>peuvent conna</w:t>
+            </w:r>
+            <w:r>
+              <w:rPr>
+                <w:rFonts w:ascii="AppleSystemUIFont" w:hAnsi="AppleSystemUIFont" w:cs="AppleSystemUIFont"/>
+                <w:kern w:val="0"/>
+                <w:lang w:val="fr-FR"/>
+              </w:rPr>
+              <w:t>î</w:t>
+            </w:r>
+            <w:r>
+              <w:rPr>
+                <w:rFonts w:ascii="AppleSystemUIFont" w:hAnsi="AppleSystemUIFont" w:cs="AppleSystemUIFont"/>
+                <w:kern w:val="0"/>
+                <w:lang w:val="fr-FR"/>
+              </w:rPr>
+              <w:t>tre des</w:t>
+            </w:r>
+            <w:r>
+              <w:rPr>
+                <w:rFonts w:ascii="AppleSystemUIFont" w:hAnsi="AppleSystemUIFont" w:cs="AppleSystemUIFont"/>
+                <w:kern w:val="0"/>
+                <w:lang w:val="fr-FR"/>
+              </w:rPr>
+              <w:t xml:space="preserve"> modifications.</w:t>
             </w:r>
           </w:p>
         </w:tc>
@@ -17175,7 +17270,7 @@
               <w:rPr>
                 <w:rFonts w:ascii="AppleSystemUIFont" w:hAnsi="AppleSystemUIFont" w:cs="AppleSystemUIFont"/>
                 <w:kern w:val="0"/>
-                <w:lang w:val="en-US"/>
+                <w:lang w:val="fr-FR"/>
               </w:rPr>
             </w:pPr>
             <w:proofErr w:type="gramStart"/>
@@ -17183,7 +17278,7 @@
               <w:rPr>
                 <w:rFonts w:ascii="AppleSystemUIFont" w:hAnsi="AppleSystemUIFont" w:cs="AppleSystemUIFont"/>
                 <w:kern w:val="0"/>
-                <w:lang w:val="en-US"/>
+                <w:lang w:val="fr-FR"/>
               </w:rPr>
               <w:t>Hash(</w:t>
             </w:r>
@@ -17192,53 +17287,59 @@
               <w:rPr>
                 <w:rFonts w:ascii="AppleSystemUIFont" w:hAnsi="AppleSystemUIFont" w:cs="AppleSystemUIFont"/>
                 <w:kern w:val="0"/>
-                <w:lang w:val="en-US"/>
-              </w:rPr>
-              <w:t xml:space="preserve">doc original) </w:t>
+                <w:lang w:val="fr-FR"/>
+              </w:rPr>
+              <w:t>document</w:t>
             </w:r>
             <w:r>
               <w:rPr>
                 <w:rFonts w:ascii="AppleSystemUIFont" w:hAnsi="AppleSystemUIFont" w:cs="AppleSystemUIFont"/>
                 <w:kern w:val="0"/>
-                <w:lang w:val="en-US"/>
-              </w:rPr>
-              <w:t xml:space="preserve">≠ </w:t>
-            </w:r>
-            <w:proofErr w:type="gramStart"/>
+                <w:lang w:val="fr-FR"/>
+              </w:rPr>
+              <w:t xml:space="preserve"> </w:t>
+            </w:r>
             <w:r>
               <w:rPr>
                 <w:rFonts w:ascii="AppleSystemUIFont" w:hAnsi="AppleSystemUIFont" w:cs="AppleSystemUIFont"/>
                 <w:kern w:val="0"/>
-                <w:lang w:val="en-US"/>
-              </w:rPr>
-              <w:t>Hash(</w:t>
-            </w:r>
-            <w:proofErr w:type="gramEnd"/>
+                <w:lang w:val="fr-FR"/>
+              </w:rPr>
+              <w:t xml:space="preserve">original) ≠ </w:t>
+            </w:r>
+            <w:proofErr w:type="gramStart"/>
             <w:r>
               <w:rPr>
                 <w:rFonts w:ascii="AppleSystemUIFont" w:hAnsi="AppleSystemUIFont" w:cs="AppleSystemUIFont"/>
                 <w:kern w:val="0"/>
-                <w:lang w:val="en-US"/>
-              </w:rPr>
-              <w:t xml:space="preserve">doc </w:t>
-            </w:r>
-            <w:proofErr w:type="spellStart"/>
+                <w:lang w:val="fr-FR"/>
+              </w:rPr>
+              <w:t>Hash(</w:t>
+            </w:r>
+            <w:proofErr w:type="gramEnd"/>
             <w:r>
               <w:rPr>
                 <w:rFonts w:ascii="AppleSystemUIFont" w:hAnsi="AppleSystemUIFont" w:cs="AppleSystemUIFont"/>
                 <w:kern w:val="0"/>
-                <w:lang w:val="en-US"/>
-              </w:rPr>
-              <w:t>modifié</w:t>
-            </w:r>
-            <w:proofErr w:type="spellEnd"/>
+                <w:lang w:val="fr-FR"/>
+              </w:rPr>
+              <w:t>document</w:t>
+            </w:r>
             <w:r>
               <w:rPr>
                 <w:rFonts w:ascii="AppleSystemUIFont" w:hAnsi="AppleSystemUIFont" w:cs="AppleSystemUIFont"/>
                 <w:kern w:val="0"/>
-                <w:lang w:val="en-US"/>
-              </w:rPr>
-              <w:t xml:space="preserve">). </w:t>
+                <w:lang w:val="fr-FR"/>
+              </w:rPr>
+              <w:t xml:space="preserve"> </w:t>
+            </w:r>
+            <w:r>
+              <w:rPr>
+                <w:rFonts w:ascii="AppleSystemUIFont" w:hAnsi="AppleSystemUIFont" w:cs="AppleSystemUIFont"/>
+                <w:kern w:val="0"/>
+                <w:lang w:val="fr-FR"/>
+              </w:rPr>
+              <w:t xml:space="preserve">modifié). </w:t>
             </w:r>
           </w:p>
           <w:p>
@@ -17278,6 +17379,762 @@
           <w:rFonts w:ascii="AppleSystemUIFont" w:hAnsi="AppleSystemUIFont" w:cs="AppleSystemUIFont"/>
           <w:kern w:val="0"/>
           <w:lang w:val="fr-FR"/>
+        </w:rPr>
+      </w:pPr>
+      <w:r>
+        <w:rPr>
+          <w:rFonts w:ascii="AppleSystemUIFont" w:hAnsi="AppleSystemUIFont" w:cs="AppleSystemUIFont"/>
+          <w:kern w:val="0"/>
+          <w:lang w:val="fr-FR"/>
+        </w:rPr>
+        <w:t xml:space="preserve">Le Table 1 </w:t>
+      </w:r>
+      <w:r>
+        <w:rPr>
+          <w:rFonts w:ascii="AppleSystemUIFont" w:hAnsi="AppleSystemUIFont" w:cs="AppleSystemUIFont"/>
+          <w:kern w:val="0"/>
+          <w:lang w:val="fr-FR"/>
+        </w:rPr>
+        <w:t>présente</w:t>
+      </w:r>
+      <w:r>
+        <w:rPr>
+          <w:rFonts w:ascii="AppleSystemUIFont" w:hAnsi="AppleSystemUIFont" w:cs="AppleSystemUIFont"/>
+          <w:kern w:val="0"/>
+          <w:lang w:val="fr-FR"/>
+        </w:rPr>
+        <w:t xml:space="preserve"> un résumé de tests d’intégrité</w:t>
+      </w:r>
+    </w:p>
+    <w:p>
+      <w:pPr>
+        <w:jc w:val="both"/>
+        <w:rPr>
+          <w:rFonts w:ascii="AppleSystemUIFont" w:hAnsi="AppleSystemUIFont" w:cs="AppleSystemUIFont"/>
+          <w:kern w:val="0"/>
+          <w:lang w:val="fr-FR"/>
+        </w:rPr>
+      </w:pPr>
+      <w:r>
+        <w:rPr>
+          <w:rFonts w:ascii="AppleSystemUIFont" w:hAnsi="AppleSystemUIFont" w:cs="AppleSystemUIFont"/>
+          <w:kern w:val="0"/>
+          <w:lang w:val="fr-FR"/>
+        </w:rPr>
+        <w:t xml:space="preserve">Table : </w:t>
+      </w:r>
+      <w:r>
+        <w:rPr>
+          <w:rFonts w:ascii="AppleSystemUIFont" w:hAnsi="AppleSystemUIFont" w:cs="AppleSystemUIFont"/>
+          <w:kern w:val="0"/>
+          <w:lang w:val="fr-FR"/>
+        </w:rPr>
+        <w:t xml:space="preserve">file </w:t>
+      </w:r>
+      <w:proofErr w:type="spellStart"/>
+      <w:r>
+        <w:rPr>
+          <w:rFonts w:ascii="AppleSystemUIFont" w:hAnsi="AppleSystemUIFont" w:cs="AppleSystemUIFont"/>
+          <w:kern w:val="0"/>
+          <w:lang w:val="fr-FR"/>
+        </w:rPr>
+        <w:t>integrity</w:t>
+      </w:r>
+      <w:proofErr w:type="spellEnd"/>
+      <w:r>
+        <w:rPr>
+          <w:rFonts w:ascii="AppleSystemUIFont" w:hAnsi="AppleSystemUIFont" w:cs="AppleSystemUIFont"/>
+          <w:kern w:val="0"/>
+          <w:lang w:val="fr-FR"/>
+        </w:rPr>
+        <w:t xml:space="preserve"> tests</w:t>
+      </w:r>
+    </w:p>
+    <w:tbl>
+      <w:tblPr>
+        <w:tblStyle w:val="Grilledutableau"/>
+        <w:tblW w:w="0" w:type="auto"/>
+        <w:tblLook w:val="04A0" w:firstRow="1" w:lastRow="0" w:firstColumn="1" w:lastColumn="0" w:noHBand="0" w:noVBand="1"/>
+      </w:tblPr>
+      <w:tblGrid>
+        <w:gridCol w:w="3487"/>
+        <w:gridCol w:w="1611"/>
+        <w:gridCol w:w="1701"/>
+        <w:gridCol w:w="7149"/>
+      </w:tblGrid>
+      <w:tr>
+        <w:tc>
+          <w:tcPr>
+            <w:tcW w:w="3487" w:type="dxa"/>
+          </w:tcPr>
+          <w:p>
+            <w:pPr>
+              <w:jc w:val="both"/>
+              <w:rPr>
+                <w:rFonts w:ascii="AppleSystemUIFont" w:hAnsi="AppleSystemUIFont" w:cs="AppleSystemUIFont"/>
+                <w:kern w:val="0"/>
+                <w:lang w:val="fr-FR"/>
+              </w:rPr>
+            </w:pPr>
+            <w:proofErr w:type="spellStart"/>
+            <w:r>
+              <w:rPr>
+                <w:rFonts w:ascii="AppleSystemUIFont" w:hAnsi="AppleSystemUIFont" w:cs="AppleSystemUIFont"/>
+                <w:kern w:val="0"/>
+                <w:lang w:val="fr-FR"/>
+              </w:rPr>
+              <w:t>Experimental</w:t>
+            </w:r>
+            <w:proofErr w:type="spellEnd"/>
+            <w:r>
+              <w:rPr>
+                <w:rFonts w:ascii="AppleSystemUIFont" w:hAnsi="AppleSystemUIFont" w:cs="AppleSystemUIFont"/>
+                <w:kern w:val="0"/>
+                <w:lang w:val="fr-FR"/>
+              </w:rPr>
+              <w:t xml:space="preserve"> action</w:t>
+            </w:r>
+          </w:p>
+        </w:tc>
+        <w:tc>
+          <w:tcPr>
+            <w:tcW w:w="1611" w:type="dxa"/>
+          </w:tcPr>
+          <w:p>
+            <w:pPr>
+              <w:jc w:val="both"/>
+              <w:rPr>
+                <w:rFonts w:ascii="AppleSystemUIFont" w:hAnsi="AppleSystemUIFont" w:cs="AppleSystemUIFont"/>
+                <w:kern w:val="0"/>
+                <w:lang w:val="en-US"/>
+              </w:rPr>
+            </w:pPr>
+            <w:r>
+              <w:rPr>
+                <w:rFonts w:ascii="AppleSystemUIFont" w:hAnsi="AppleSystemUIFont" w:cs="AppleSystemUIFont"/>
+                <w:kern w:val="0"/>
+                <w:lang w:val="en-US"/>
+              </w:rPr>
+              <w:t>Can the document be saved again?</w:t>
+            </w:r>
+          </w:p>
+        </w:tc>
+        <w:tc>
+          <w:tcPr>
+            <w:tcW w:w="1701" w:type="dxa"/>
+          </w:tcPr>
+          <w:p>
+            <w:pPr>
+              <w:jc w:val="both"/>
+              <w:rPr>
+                <w:rFonts w:ascii="AppleSystemUIFont" w:hAnsi="AppleSystemUIFont" w:cs="AppleSystemUIFont"/>
+                <w:kern w:val="0"/>
+                <w:lang w:val="en-US"/>
+              </w:rPr>
+            </w:pPr>
+            <w:r>
+              <w:rPr>
+                <w:rFonts w:ascii="AppleSystemUIFont" w:hAnsi="AppleSystemUIFont" w:cs="AppleSystemUIFont"/>
+                <w:kern w:val="0"/>
+                <w:lang w:val="en-US"/>
+              </w:rPr>
+              <w:t>Is this a document with integrity?</w:t>
+            </w:r>
+          </w:p>
+        </w:tc>
+        <w:tc>
+          <w:tcPr>
+            <w:tcW w:w="7149" w:type="dxa"/>
+          </w:tcPr>
+          <w:p>
+            <w:pPr>
+              <w:jc w:val="both"/>
+              <w:rPr>
+                <w:rFonts w:ascii="AppleSystemUIFont" w:hAnsi="AppleSystemUIFont" w:cs="AppleSystemUIFont"/>
+                <w:kern w:val="0"/>
+                <w:lang w:val="en-US"/>
+              </w:rPr>
+            </w:pPr>
+            <w:r>
+              <w:rPr>
+                <w:rFonts w:ascii="AppleSystemUIFont" w:hAnsi="AppleSystemUIFont" w:cs="AppleSystemUIFont"/>
+                <w:kern w:val="0"/>
+                <w:lang w:val="en-US"/>
+              </w:rPr>
+              <w:t>Observation</w:t>
+            </w:r>
+          </w:p>
+        </w:tc>
+      </w:tr>
+      <w:tr>
+        <w:tc>
+          <w:tcPr>
+            <w:tcW w:w="3487" w:type="dxa"/>
+          </w:tcPr>
+          <w:p>
+            <w:pPr>
+              <w:jc w:val="both"/>
+              <w:rPr>
+                <w:rFonts w:ascii="AppleSystemUIFont" w:hAnsi="AppleSystemUIFont" w:cs="AppleSystemUIFont"/>
+                <w:kern w:val="0"/>
+                <w:lang w:val="en-US"/>
+              </w:rPr>
+            </w:pPr>
+            <w:r>
+              <w:rPr>
+                <w:rFonts w:ascii="AppleSystemUIFont" w:hAnsi="AppleSystemUIFont" w:cs="AppleSystemUIFont"/>
+                <w:kern w:val="0"/>
+                <w:lang w:val="en-US"/>
+              </w:rPr>
+              <w:t>After transferring the document several times (via USB, email, WhatsApp, etc.)</w:t>
+            </w:r>
+          </w:p>
+        </w:tc>
+        <w:tc>
+          <w:tcPr>
+            <w:tcW w:w="1611" w:type="dxa"/>
+          </w:tcPr>
+          <w:p>
+            <w:pPr>
+              <w:jc w:val="both"/>
+              <w:rPr>
+                <w:rFonts w:ascii="AppleSystemUIFont" w:hAnsi="AppleSystemUIFont" w:cs="AppleSystemUIFont"/>
+                <w:kern w:val="0"/>
+                <w:lang w:val="en-US"/>
+              </w:rPr>
+            </w:pPr>
+            <w:r>
+              <w:rPr>
+                <w:rFonts w:ascii="AppleSystemUIFont" w:hAnsi="AppleSystemUIFont" w:cs="AppleSystemUIFont"/>
+                <w:kern w:val="0"/>
+                <w:lang w:val="en-US"/>
+              </w:rPr>
+              <w:t>No</w:t>
+            </w:r>
+          </w:p>
+        </w:tc>
+        <w:tc>
+          <w:tcPr>
+            <w:tcW w:w="1701" w:type="dxa"/>
+          </w:tcPr>
+          <w:p>
+            <w:pPr>
+              <w:jc w:val="both"/>
+              <w:rPr>
+                <w:rFonts w:ascii="AppleSystemUIFont" w:hAnsi="AppleSystemUIFont" w:cs="AppleSystemUIFont"/>
+                <w:kern w:val="0"/>
+                <w:lang w:val="en-US"/>
+              </w:rPr>
+            </w:pPr>
+            <w:r>
+              <w:rPr>
+                <w:rFonts w:ascii="AppleSystemUIFont" w:hAnsi="AppleSystemUIFont" w:cs="AppleSystemUIFont"/>
+                <w:kern w:val="0"/>
+                <w:lang w:val="en-US"/>
+              </w:rPr>
+              <w:t xml:space="preserve">Yes </w:t>
+            </w:r>
+          </w:p>
+        </w:tc>
+        <w:tc>
+          <w:tcPr>
+            <w:tcW w:w="7149" w:type="dxa"/>
+          </w:tcPr>
+          <w:p>
+            <w:pPr>
+              <w:jc w:val="both"/>
+              <w:rPr>
+                <w:rFonts w:ascii="AppleSystemUIFont" w:hAnsi="AppleSystemUIFont" w:cs="AppleSystemUIFont"/>
+                <w:kern w:val="0"/>
+                <w:lang w:val="en-US"/>
+              </w:rPr>
+            </w:pPr>
+            <w:proofErr w:type="gramStart"/>
+            <w:r>
+              <w:rPr>
+                <w:rFonts w:ascii="AppleSystemUIFont" w:hAnsi="AppleSystemUIFont" w:cs="AppleSystemUIFont"/>
+                <w:kern w:val="0"/>
+                <w:lang w:val="en-US"/>
+              </w:rPr>
+              <w:t>Hash(</w:t>
+            </w:r>
+            <w:proofErr w:type="gramEnd"/>
+            <w:r>
+              <w:rPr>
+                <w:rFonts w:ascii="AppleSystemUIFont" w:hAnsi="AppleSystemUIFont" w:cs="AppleSystemUIFont"/>
+                <w:kern w:val="0"/>
+                <w:lang w:val="en-US"/>
+              </w:rPr>
+              <w:t xml:space="preserve">original document) = </w:t>
+            </w:r>
+            <w:proofErr w:type="gramStart"/>
+            <w:r>
+              <w:rPr>
+                <w:rFonts w:ascii="AppleSystemUIFont" w:hAnsi="AppleSystemUIFont" w:cs="AppleSystemUIFont"/>
+                <w:kern w:val="0"/>
+                <w:lang w:val="en-US"/>
+              </w:rPr>
+              <w:t>Hash(</w:t>
+            </w:r>
+            <w:proofErr w:type="gramEnd"/>
+            <w:r>
+              <w:rPr>
+                <w:rFonts w:ascii="AppleSystemUIFont" w:hAnsi="AppleSystemUIFont" w:cs="AppleSystemUIFont"/>
+                <w:kern w:val="0"/>
+                <w:lang w:val="en-US"/>
+              </w:rPr>
+              <w:t xml:space="preserve">transferred document). </w:t>
+            </w:r>
+          </w:p>
+          <w:p>
+            <w:pPr>
+              <w:jc w:val="both"/>
+              <w:rPr>
+                <w:rFonts w:ascii="AppleSystemUIFont" w:hAnsi="AppleSystemUIFont" w:cs="AppleSystemUIFont"/>
+                <w:kern w:val="0"/>
+                <w:lang w:val="en-US"/>
+              </w:rPr>
+            </w:pPr>
+            <w:r>
+              <w:rPr>
+                <w:rFonts w:ascii="AppleSystemUIFont" w:hAnsi="AppleSystemUIFont" w:cs="AppleSystemUIFont"/>
+                <w:kern w:val="0"/>
+                <w:lang w:val="en-US"/>
+              </w:rPr>
+              <w:t>The integrity of the document, as verified by its cryptographic hash, remains guaranteed even after multiple transfers of the document.</w:t>
+            </w:r>
+          </w:p>
+        </w:tc>
+      </w:tr>
+      <w:tr>
+        <w:tc>
+          <w:tcPr>
+            <w:tcW w:w="3487" w:type="dxa"/>
+          </w:tcPr>
+          <w:p>
+            <w:pPr>
+              <w:jc w:val="both"/>
+              <w:rPr>
+                <w:rFonts w:ascii="AppleSystemUIFont" w:hAnsi="AppleSystemUIFont" w:cs="AppleSystemUIFont"/>
+                <w:kern w:val="0"/>
+                <w:lang w:val="en-US"/>
+              </w:rPr>
+            </w:pPr>
+            <w:r>
+              <w:rPr>
+                <w:rFonts w:ascii="AppleSystemUIFont" w:hAnsi="AppleSystemUIFont" w:cs="AppleSystemUIFont"/>
+                <w:kern w:val="0"/>
+                <w:lang w:val="en-US"/>
+              </w:rPr>
+              <w:t>After renaming the document</w:t>
+            </w:r>
+          </w:p>
+        </w:tc>
+        <w:tc>
+          <w:tcPr>
+            <w:tcW w:w="1611" w:type="dxa"/>
+          </w:tcPr>
+          <w:p>
+            <w:pPr>
+              <w:jc w:val="both"/>
+              <w:rPr>
+                <w:rFonts w:ascii="AppleSystemUIFont" w:hAnsi="AppleSystemUIFont" w:cs="AppleSystemUIFont"/>
+                <w:kern w:val="0"/>
+                <w:lang w:val="en-US"/>
+              </w:rPr>
+            </w:pPr>
+            <w:r>
+              <w:rPr>
+                <w:rFonts w:ascii="AppleSystemUIFont" w:hAnsi="AppleSystemUIFont" w:cs="AppleSystemUIFont"/>
+                <w:kern w:val="0"/>
+                <w:lang w:val="en-US"/>
+              </w:rPr>
+              <w:t xml:space="preserve">No </w:t>
+            </w:r>
+          </w:p>
+        </w:tc>
+        <w:tc>
+          <w:tcPr>
+            <w:tcW w:w="1701" w:type="dxa"/>
+          </w:tcPr>
+          <w:p>
+            <w:pPr>
+              <w:jc w:val="both"/>
+              <w:rPr>
+                <w:rFonts w:ascii="AppleSystemUIFont" w:hAnsi="AppleSystemUIFont" w:cs="AppleSystemUIFont"/>
+                <w:kern w:val="0"/>
+                <w:lang w:val="en-US"/>
+              </w:rPr>
+            </w:pPr>
+            <w:r>
+              <w:rPr>
+                <w:rFonts w:ascii="AppleSystemUIFont" w:hAnsi="AppleSystemUIFont" w:cs="AppleSystemUIFont"/>
+                <w:kern w:val="0"/>
+                <w:lang w:val="en-US"/>
+              </w:rPr>
+              <w:t xml:space="preserve">Yes </w:t>
+            </w:r>
+          </w:p>
+        </w:tc>
+        <w:tc>
+          <w:tcPr>
+            <w:tcW w:w="7149" w:type="dxa"/>
+          </w:tcPr>
+          <w:p>
+            <w:pPr>
+              <w:jc w:val="both"/>
+              <w:rPr>
+                <w:rFonts w:ascii="AppleSystemUIFont" w:hAnsi="AppleSystemUIFont" w:cs="AppleSystemUIFont"/>
+                <w:kern w:val="0"/>
+                <w:lang w:val="en-US"/>
+              </w:rPr>
+            </w:pPr>
+            <w:proofErr w:type="gramStart"/>
+            <w:r>
+              <w:rPr>
+                <w:rFonts w:ascii="AppleSystemUIFont" w:hAnsi="AppleSystemUIFont" w:cs="AppleSystemUIFont"/>
+                <w:kern w:val="0"/>
+                <w:lang w:val="en-US"/>
+              </w:rPr>
+              <w:t>Hash(</w:t>
+            </w:r>
+            <w:proofErr w:type="gramEnd"/>
+            <w:r>
+              <w:rPr>
+                <w:rFonts w:ascii="AppleSystemUIFont" w:hAnsi="AppleSystemUIFont" w:cs="AppleSystemUIFont"/>
+                <w:kern w:val="0"/>
+                <w:lang w:val="en-US"/>
+              </w:rPr>
+              <w:t xml:space="preserve">original document) = </w:t>
+            </w:r>
+            <w:proofErr w:type="gramStart"/>
+            <w:r>
+              <w:rPr>
+                <w:rFonts w:ascii="AppleSystemUIFont" w:hAnsi="AppleSystemUIFont" w:cs="AppleSystemUIFont"/>
+                <w:kern w:val="0"/>
+                <w:lang w:val="en-US"/>
+              </w:rPr>
+              <w:t>Hash(</w:t>
+            </w:r>
+            <w:proofErr w:type="gramEnd"/>
+            <w:r>
+              <w:rPr>
+                <w:rFonts w:ascii="AppleSystemUIFont" w:hAnsi="AppleSystemUIFont" w:cs="AppleSystemUIFont"/>
+                <w:kern w:val="0"/>
+                <w:lang w:val="en-US"/>
+              </w:rPr>
+              <w:t xml:space="preserve">renamed document). </w:t>
+            </w:r>
+          </w:p>
+          <w:p>
+            <w:pPr>
+              <w:jc w:val="both"/>
+              <w:rPr>
+                <w:rFonts w:ascii="AppleSystemUIFont" w:hAnsi="AppleSystemUIFont" w:cs="AppleSystemUIFont"/>
+                <w:kern w:val="0"/>
+                <w:lang w:val="en-US"/>
+              </w:rPr>
+            </w:pPr>
+            <w:r>
+              <w:rPr>
+                <w:rFonts w:ascii="AppleSystemUIFont" w:hAnsi="AppleSystemUIFont" w:cs="AppleSystemUIFont"/>
+                <w:kern w:val="0"/>
+                <w:lang w:val="en-US"/>
+              </w:rPr>
+              <w:t>The use of binary hashing ensures that each document is uniquely identified even after it has been renamed.</w:t>
+            </w:r>
+          </w:p>
+        </w:tc>
+      </w:tr>
+      <w:tr>
+        <w:tc>
+          <w:tcPr>
+            <w:tcW w:w="3487" w:type="dxa"/>
+          </w:tcPr>
+          <w:p>
+            <w:pPr>
+              <w:jc w:val="both"/>
+              <w:rPr>
+                <w:rFonts w:ascii="AppleSystemUIFont" w:hAnsi="AppleSystemUIFont" w:cs="AppleSystemUIFont"/>
+                <w:kern w:val="0"/>
+                <w:lang w:val="en-US"/>
+              </w:rPr>
+            </w:pPr>
+            <w:r>
+              <w:rPr>
+                <w:rFonts w:ascii="AppleSystemUIFont" w:hAnsi="AppleSystemUIFont" w:cs="AppleSystemUIFont"/>
+                <w:kern w:val="0"/>
+                <w:lang w:val="en-US"/>
+              </w:rPr>
+              <w:lastRenderedPageBreak/>
+              <w:t>After compressing the document (from 107.16 KB to 77.80 KB using pdf24 for Windows)</w:t>
+            </w:r>
+          </w:p>
+        </w:tc>
+        <w:tc>
+          <w:tcPr>
+            <w:tcW w:w="1611" w:type="dxa"/>
+          </w:tcPr>
+          <w:p>
+            <w:pPr>
+              <w:jc w:val="both"/>
+              <w:rPr>
+                <w:rFonts w:ascii="AppleSystemUIFont" w:hAnsi="AppleSystemUIFont" w:cs="AppleSystemUIFont"/>
+                <w:kern w:val="0"/>
+                <w:lang w:val="en-US"/>
+              </w:rPr>
+            </w:pPr>
+            <w:r>
+              <w:rPr>
+                <w:rFonts w:ascii="AppleSystemUIFont" w:hAnsi="AppleSystemUIFont" w:cs="AppleSystemUIFont"/>
+                <w:kern w:val="0"/>
+                <w:lang w:val="en-US"/>
+              </w:rPr>
+              <w:t xml:space="preserve">Yes </w:t>
+            </w:r>
+          </w:p>
+        </w:tc>
+        <w:tc>
+          <w:tcPr>
+            <w:tcW w:w="1701" w:type="dxa"/>
+          </w:tcPr>
+          <w:p>
+            <w:pPr>
+              <w:jc w:val="both"/>
+              <w:rPr>
+                <w:rFonts w:ascii="AppleSystemUIFont" w:hAnsi="AppleSystemUIFont" w:cs="AppleSystemUIFont"/>
+                <w:kern w:val="0"/>
+                <w:lang w:val="en-US"/>
+              </w:rPr>
+            </w:pPr>
+            <w:r>
+              <w:rPr>
+                <w:rFonts w:ascii="AppleSystemUIFont" w:hAnsi="AppleSystemUIFont" w:cs="AppleSystemUIFont"/>
+                <w:kern w:val="0"/>
+                <w:lang w:val="en-US"/>
+              </w:rPr>
+              <w:t xml:space="preserve">No </w:t>
+            </w:r>
+          </w:p>
+        </w:tc>
+        <w:tc>
+          <w:tcPr>
+            <w:tcW w:w="7149" w:type="dxa"/>
+          </w:tcPr>
+          <w:p>
+            <w:pPr>
+              <w:jc w:val="both"/>
+              <w:rPr>
+                <w:rFonts w:ascii="AppleSystemUIFont" w:hAnsi="AppleSystemUIFont" w:cs="AppleSystemUIFont"/>
+                <w:kern w:val="0"/>
+                <w:lang w:val="en-US"/>
+              </w:rPr>
+            </w:pPr>
+            <w:proofErr w:type="gramStart"/>
+            <w:r>
+              <w:rPr>
+                <w:rFonts w:ascii="AppleSystemUIFont" w:hAnsi="AppleSystemUIFont" w:cs="AppleSystemUIFont"/>
+                <w:kern w:val="0"/>
+                <w:lang w:val="en-US"/>
+              </w:rPr>
+              <w:t>Hash(</w:t>
+            </w:r>
+            <w:proofErr w:type="gramEnd"/>
+            <w:r>
+              <w:rPr>
+                <w:rFonts w:ascii="AppleSystemUIFont" w:hAnsi="AppleSystemUIFont" w:cs="AppleSystemUIFont"/>
+                <w:kern w:val="0"/>
+                <w:lang w:val="en-US"/>
+              </w:rPr>
+              <w:t xml:space="preserve">original document) ≠ </w:t>
+            </w:r>
+            <w:proofErr w:type="gramStart"/>
+            <w:r>
+              <w:rPr>
+                <w:rFonts w:ascii="AppleSystemUIFont" w:hAnsi="AppleSystemUIFont" w:cs="AppleSystemUIFont"/>
+                <w:kern w:val="0"/>
+                <w:lang w:val="en-US"/>
+              </w:rPr>
+              <w:t>Hash(</w:t>
+            </w:r>
+            <w:proofErr w:type="gramEnd"/>
+            <w:r>
+              <w:rPr>
+                <w:rFonts w:ascii="AppleSystemUIFont" w:hAnsi="AppleSystemUIFont" w:cs="AppleSystemUIFont"/>
+                <w:kern w:val="0"/>
+                <w:lang w:val="en-US"/>
+              </w:rPr>
+              <w:t xml:space="preserve">compressed document). </w:t>
+            </w:r>
+          </w:p>
+          <w:p>
+            <w:pPr>
+              <w:jc w:val="both"/>
+              <w:rPr>
+                <w:rFonts w:ascii="AppleSystemUIFont" w:hAnsi="AppleSystemUIFont" w:cs="AppleSystemUIFont"/>
+                <w:kern w:val="0"/>
+                <w:lang w:val="en-US"/>
+              </w:rPr>
+            </w:pPr>
+            <w:r>
+              <w:rPr>
+                <w:rFonts w:ascii="AppleSystemUIFont" w:hAnsi="AppleSystemUIFont" w:cs="AppleSystemUIFont"/>
+                <w:kern w:val="0"/>
+                <w:lang w:val="en-US"/>
+              </w:rPr>
+              <w:t>The compressed binary file is not identical to the original binary file (different hashes) even if the content appears to be the same. After compression, the file’s internal structure, its encoding, its metadata (author, creation/last modification dates, software used, etc.), and even the order of the objects may have changed.</w:t>
+            </w:r>
+          </w:p>
+        </w:tc>
+      </w:tr>
+      <w:tr>
+        <w:tc>
+          <w:tcPr>
+            <w:tcW w:w="3487" w:type="dxa"/>
+          </w:tcPr>
+          <w:p>
+            <w:pPr>
+              <w:jc w:val="both"/>
+              <w:rPr>
+                <w:rFonts w:ascii="AppleSystemUIFont" w:hAnsi="AppleSystemUIFont" w:cs="AppleSystemUIFont"/>
+                <w:kern w:val="0"/>
+                <w:lang w:val="en-US"/>
+              </w:rPr>
+            </w:pPr>
+            <w:r>
+              <w:rPr>
+                <w:rFonts w:ascii="AppleSystemUIFont" w:hAnsi="AppleSystemUIFont" w:cs="AppleSystemUIFont"/>
+                <w:kern w:val="0"/>
+                <w:lang w:val="en-US"/>
+              </w:rPr>
+              <w:t>After editing the document</w:t>
+            </w:r>
+          </w:p>
+        </w:tc>
+        <w:tc>
+          <w:tcPr>
+            <w:tcW w:w="1611" w:type="dxa"/>
+          </w:tcPr>
+          <w:p>
+            <w:pPr>
+              <w:jc w:val="both"/>
+              <w:rPr>
+                <w:rFonts w:ascii="AppleSystemUIFont" w:hAnsi="AppleSystemUIFont" w:cs="AppleSystemUIFont"/>
+                <w:kern w:val="0"/>
+                <w:lang w:val="en-US"/>
+              </w:rPr>
+            </w:pPr>
+            <w:r>
+              <w:rPr>
+                <w:rFonts w:ascii="AppleSystemUIFont" w:hAnsi="AppleSystemUIFont" w:cs="AppleSystemUIFont"/>
+                <w:kern w:val="0"/>
+                <w:lang w:val="en-US"/>
+              </w:rPr>
+              <w:t xml:space="preserve">Yes </w:t>
+            </w:r>
+          </w:p>
+        </w:tc>
+        <w:tc>
+          <w:tcPr>
+            <w:tcW w:w="1701" w:type="dxa"/>
+          </w:tcPr>
+          <w:p>
+            <w:pPr>
+              <w:jc w:val="both"/>
+              <w:rPr>
+                <w:rFonts w:ascii="AppleSystemUIFont" w:hAnsi="AppleSystemUIFont" w:cs="AppleSystemUIFont"/>
+                <w:kern w:val="0"/>
+                <w:lang w:val="en-US"/>
+              </w:rPr>
+            </w:pPr>
+            <w:r>
+              <w:rPr>
+                <w:rFonts w:ascii="AppleSystemUIFont" w:hAnsi="AppleSystemUIFont" w:cs="AppleSystemUIFont"/>
+                <w:kern w:val="0"/>
+                <w:lang w:val="en-US"/>
+              </w:rPr>
+              <w:t xml:space="preserve">No </w:t>
+            </w:r>
+          </w:p>
+        </w:tc>
+        <w:tc>
+          <w:tcPr>
+            <w:tcW w:w="7149" w:type="dxa"/>
+          </w:tcPr>
+          <w:p>
+            <w:pPr>
+              <w:jc w:val="both"/>
+              <w:rPr>
+                <w:rFonts w:ascii="AppleSystemUIFont" w:hAnsi="AppleSystemUIFont" w:cs="AppleSystemUIFont"/>
+                <w:kern w:val="0"/>
+                <w:lang w:val="en-US"/>
+              </w:rPr>
+            </w:pPr>
+            <w:proofErr w:type="gramStart"/>
+            <w:r>
+              <w:rPr>
+                <w:rFonts w:ascii="AppleSystemUIFont" w:hAnsi="AppleSystemUIFont" w:cs="AppleSystemUIFont"/>
+                <w:kern w:val="0"/>
+                <w:lang w:val="en-US"/>
+              </w:rPr>
+              <w:t>Hash(</w:t>
+            </w:r>
+            <w:proofErr w:type="gramEnd"/>
+            <w:r>
+              <w:rPr>
+                <w:rFonts w:ascii="AppleSystemUIFont" w:hAnsi="AppleSystemUIFont" w:cs="AppleSystemUIFont"/>
+                <w:kern w:val="0"/>
+                <w:lang w:val="en-US"/>
+              </w:rPr>
+              <w:t xml:space="preserve">original document) ≠ </w:t>
+            </w:r>
+            <w:proofErr w:type="gramStart"/>
+            <w:r>
+              <w:rPr>
+                <w:rFonts w:ascii="AppleSystemUIFont" w:hAnsi="AppleSystemUIFont" w:cs="AppleSystemUIFont"/>
+                <w:kern w:val="0"/>
+                <w:lang w:val="en-US"/>
+              </w:rPr>
+              <w:t>Hash(</w:t>
+            </w:r>
+            <w:proofErr w:type="gramEnd"/>
+            <w:r>
+              <w:rPr>
+                <w:rFonts w:ascii="AppleSystemUIFont" w:hAnsi="AppleSystemUIFont" w:cs="AppleSystemUIFont"/>
+                <w:kern w:val="0"/>
+                <w:lang w:val="en-US"/>
+              </w:rPr>
+              <w:t xml:space="preserve">modified document). </w:t>
+            </w:r>
+          </w:p>
+          <w:p>
+            <w:pPr>
+              <w:jc w:val="both"/>
+              <w:rPr>
+                <w:rFonts w:ascii="AppleSystemUIFont" w:hAnsi="AppleSystemUIFont" w:cs="AppleSystemUIFont"/>
+                <w:kern w:val="0"/>
+                <w:lang w:val="en-US"/>
+              </w:rPr>
+            </w:pPr>
+            <w:r>
+              <w:rPr>
+                <w:rFonts w:ascii="AppleSystemUIFont" w:hAnsi="AppleSystemUIFont" w:cs="AppleSystemUIFont"/>
+                <w:kern w:val="0"/>
+                <w:lang w:val="en-US"/>
+              </w:rPr>
+              <w:t>This document is not identical to the original document. The document's integrity has been compromised.</w:t>
+            </w:r>
+          </w:p>
+        </w:tc>
+      </w:tr>
+    </w:tbl>
+    <w:p>
+      <w:pPr>
+        <w:jc w:val="both"/>
+        <w:rPr>
+          <w:rFonts w:ascii="AppleSystemUIFont" w:hAnsi="AppleSystemUIFont" w:cs="AppleSystemUIFont"/>
+          <w:kern w:val="0"/>
+          <w:lang w:val="en-US"/>
         </w:rPr>
       </w:pPr>
     </w:p>

</xml_diff>